<commit_message>
Atualização Texto das Anuências
</commit_message>
<xml_diff>
--- a/DocsGen/templates/NR10.docx
+++ b/DocsGen/templates/NR10.docx
@@ -173,37 +173,7 @@
         <w:rPr>
           <w:rFonts w:ascii="Arial" w:hAnsi="Arial" w:cs="Arial"/>
         </w:rPr>
-        <w:t xml:space="preserve">- No exercício de suas atividades, o </w:t>
-      </w:r>
-      <w:r>
-        <w:rPr>
-          <w:rFonts w:ascii="Arial" w:hAnsi="Arial" w:cs="Arial"/>
-        </w:rPr>
-        <w:t xml:space="preserve">profissional </w:t>
-      </w:r>
-      <w:r>
-        <w:rPr>
-          <w:rFonts w:ascii="Arial" w:hAnsi="Arial" w:cs="Arial"/>
-        </w:rPr>
-        <w:t xml:space="preserve">observará as </w:t>
-      </w:r>
-      <w:r>
-        <w:rPr>
-          <w:rFonts w:ascii="Arial" w:hAnsi="Arial" w:cs="Arial"/>
-        </w:rPr>
-        <w:t xml:space="preserve">determinações contidas nos manuais, procedimentos e instruções de trabalho da VESTAS, assim como as </w:t>
-      </w:r>
-      <w:r>
-        <w:rPr>
-          <w:rFonts w:ascii="Arial" w:hAnsi="Arial" w:cs="Arial"/>
-        </w:rPr>
-        <w:t>disposições aplicáveis da Norma Regulamentadora NR-10</w:t>
-      </w:r>
-      <w:r>
-        <w:rPr>
-          <w:rFonts w:ascii="Arial" w:hAnsi="Arial" w:cs="Arial"/>
-        </w:rPr>
-        <w:t>;</w:t>
+        <w:t xml:space="preserve">- No exercício de suas atividades, o profissional observará as determinações contidas nos manuais, procedimentos e instruções de trabalho da VESTAS, assim como as disposições aplicáveis da Norma Regulamentadora NR-10; </w:t>
       </w:r>
     </w:p>
     <w:p>
@@ -214,60 +184,6 @@
           <w:rFonts w:ascii="Arial" w:hAnsi="Arial" w:cs="Arial"/>
         </w:rPr>
       </w:pPr>
-      <w:r>
-        <w:rPr>
-          <w:rFonts w:ascii="Arial" w:hAnsi="Arial" w:cs="Arial"/>
-        </w:rPr>
-        <w:t>-</w:t>
-      </w:r>
-      <w:r>
-        <w:rPr>
-          <w:rFonts w:ascii="Arial" w:hAnsi="Arial" w:cs="Arial"/>
-        </w:rPr>
-        <w:t xml:space="preserve"> </w:t>
-      </w:r>
-      <w:r>
-        <w:rPr>
-          <w:rFonts w:ascii="Arial" w:hAnsi="Arial" w:cs="Arial"/>
-        </w:rPr>
-        <w:t>O</w:t>
-      </w:r>
-      <w:r>
-        <w:rPr>
-          <w:rFonts w:ascii="Arial" w:hAnsi="Arial" w:cs="Arial"/>
-        </w:rPr>
-        <w:t xml:space="preserve"> profissional é devidamente QUALIFICADO conforme certificado de curso </w:t>
-      </w:r>
-      <w:r>
-        <w:rPr>
-          <w:rFonts w:ascii="Arial" w:hAnsi="Arial" w:cs="Arial"/>
-        </w:rPr>
-        <w:t>específico</w:t>
-      </w:r>
-      <w:r>
-        <w:rPr>
-          <w:rFonts w:ascii="Arial" w:hAnsi="Arial" w:cs="Arial"/>
-        </w:rPr>
-        <w:t>, oficialmente reconhecido,</w:t>
-      </w:r>
-      <w:r>
-        <w:rPr>
-          <w:rFonts w:ascii="Arial" w:hAnsi="Arial" w:cs="Arial"/>
-        </w:rPr>
-        <w:t xml:space="preserve"> </w:t>
-      </w:r>
-      <w:r>
-        <w:rPr>
-          <w:rFonts w:ascii="Arial" w:hAnsi="Arial" w:cs="Arial"/>
-        </w:rPr>
-        <w:t>aprese</w:t>
-      </w:r>
-      <w:r>
-        <w:rPr>
-          <w:rFonts w:ascii="Arial" w:hAnsi="Arial" w:cs="Arial"/>
-        </w:rPr>
-        <w:t>ntado no ato de sua contratação;</w:t>
-      </w:r>
     </w:p>
     <w:p>
       <w:pPr>
@@ -281,50 +197,41 @@
         <w:rPr>
           <w:rFonts w:ascii="Arial" w:hAnsi="Arial" w:cs="Arial"/>
         </w:rPr>
-        <w:t>- O</w:t>
-      </w:r>
-      <w:r>
-        <w:rPr>
-          <w:rFonts w:ascii="Arial" w:hAnsi="Arial" w:cs="Arial"/>
-        </w:rPr>
-        <w:t xml:space="preserve"> profissional recebeu os treinamentos necessários</w:t>
-      </w:r>
-      <w:r>
-        <w:rPr>
-          <w:rFonts w:ascii="Arial" w:hAnsi="Arial" w:cs="Arial"/>
-        </w:rPr>
-        <w:t xml:space="preserve"> e se encontra CAPACITADO</w:t>
-      </w:r>
-      <w:r>
-        <w:rPr>
-          <w:rFonts w:ascii="Arial" w:hAnsi="Arial" w:cs="Arial"/>
-        </w:rPr>
-        <w:t>,</w:t>
-      </w:r>
-      <w:r>
-        <w:rPr>
-          <w:rFonts w:ascii="Arial" w:hAnsi="Arial" w:cs="Arial"/>
-        </w:rPr>
-        <w:t xml:space="preserve"> conforme Anexo II da NR-10</w:t>
-      </w:r>
-      <w:r>
-        <w:rPr>
-          <w:rFonts w:ascii="Arial" w:hAnsi="Arial" w:cs="Arial"/>
-        </w:rPr>
-        <w:t xml:space="preserve"> (Curso Básico</w:t>
-      </w:r>
-      <w:r>
-        <w:rPr>
-          <w:rFonts w:ascii="Arial" w:hAnsi="Arial" w:cs="Arial"/>
-        </w:rPr>
-        <w:t>, incluindo reciclagens bianuais, quando aplicável</w:t>
-      </w:r>
-      <w:r>
-        <w:rPr>
-          <w:rFonts w:ascii="Arial" w:hAnsi="Arial" w:cs="Arial"/>
-        </w:rPr>
-        <w:t>);</w:t>
-      </w:r>
+        <w:t xml:space="preserve">- O profissional é devidamente QUALIFICADO conforme certificado de curso específico, oficialmente reconhecido, apresentado no ato de sua contratação; </w:t>
+      </w:r>
+    </w:p>
+    <w:p>
+      <w:pPr>
+        <w:spacing w:after="0" w:line="240" w:lineRule="auto"/>
+        <w:jc w:val="both"/>
+        <w:rPr>
+          <w:rFonts w:ascii="Arial" w:hAnsi="Arial" w:cs="Arial"/>
+        </w:rPr>
+      </w:pPr>
+    </w:p>
+    <w:p>
+      <w:pPr>
+        <w:spacing w:after="0" w:line="240" w:lineRule="auto"/>
+        <w:jc w:val="both"/>
+        <w:rPr>
+          <w:rFonts w:ascii="Arial" w:hAnsi="Arial" w:cs="Arial"/>
+        </w:rPr>
+      </w:pPr>
+      <w:r>
+        <w:rPr>
+          <w:rFonts w:ascii="Arial" w:hAnsi="Arial" w:cs="Arial"/>
+        </w:rPr>
+        <w:t xml:space="preserve">- O profissional recebeu os treinamentos necessários e se encontra CAPACITADO, conforme Anexo III da NR-10 (Curso Básico, incluindo reciclagens bianuais, quando aplicável); </w:t>
+      </w:r>
+    </w:p>
+    <w:p>
+      <w:pPr>
+        <w:spacing w:after="0" w:line="240" w:lineRule="auto"/>
+        <w:jc w:val="both"/>
+        <w:rPr>
+          <w:rFonts w:ascii="Arial" w:hAnsi="Arial" w:cs="Arial"/>
+        </w:rPr>
+      </w:pPr>
     </w:p>
     <w:p>
       <w:pPr>
@@ -782,7 +689,9 @@
             <w:tcW w:w="3020" w:type="dxa"/>
           </w:tcPr>
           <w:p>
-            <w:r/>
+            <w:pPr>
+              <w:jc w:val="center"/>
+            </w:pPr>
             <w:r>
               <w:rPr>
                 <w:b/>
@@ -791,14 +700,10 @@
             </w:r>
             <w:r>
               <w:br/>
-            </w:r>
-            <w:r>
               <w:t>FUNCAOHSE</w:t>
             </w:r>
             <w:r>
               <w:br/>
-            </w:r>
-            <w:r>
               <w:t>REGISTROHSE</w:t>
             </w:r>
           </w:p>
@@ -996,28 +901,15 @@
         <w:lang w:val="en-US"/>
       </w:rPr>
     </w:pPr>
-    <w:r>
-      <w:fldChar w:fldCharType="begin"/>
-    </w:r>
-    <w:r>
-      <w:rPr>
-        <w:lang w:val="en-US"/>
-      </w:rPr>
-      <w:instrText>HYPERLINK "https://www.vestas.com"</w:instrText>
-    </w:r>
-    <w:r>
-      <w:fldChar w:fldCharType="separate"/>
-    </w:r>
-    <w:r>
-      <w:rPr>
-        <w:rStyle w:val="Hyperlink"/>
-        <w:lang w:val="en-US"/>
-      </w:rPr>
-      <w:t>https://www.vestas.com</w:t>
-    </w:r>
-    <w:r>
-      <w:fldChar w:fldCharType="end"/>
-    </w:r>
+    <w:hyperlink r:id="rId1" w:history="1">
+      <w:r>
+        <w:rPr>
+          <w:rStyle w:val="Hyperlink"/>
+          <w:lang w:val="en-US"/>
+        </w:rPr>
+        <w:t>https://www.vestas.com</w:t>
+      </w:r>
+    </w:hyperlink>
     <w:r>
       <w:rPr>
         <w:lang w:val="en-US"/>
@@ -2472,6 +2364,24 @@
 </file>
 
 <file path=customXml/item1.xml><?xml version="1.0" encoding="utf-8"?>
+<p:properties xmlns:p="http://schemas.microsoft.com/office/2006/metadata/properties" xmlns:xsi="http://www.w3.org/2001/XMLSchema-instance" xmlns:pc="http://schemas.microsoft.com/office/infopath/2007/PartnerControls">
+  <documentManagement>
+    <SharedWithUsers xmlns="4c61e19b-130e-4f0e-85ad-f29bf0e78033">
+      <UserInfo>
+        <DisplayName/>
+        <AccountId xsi:nil="true"/>
+        <AccountType/>
+      </UserInfo>
+    </SharedWithUsers>
+    <TaxCatchAll xmlns="4c61e19b-130e-4f0e-85ad-f29bf0e78033" xsi:nil="true"/>
+    <lcf76f155ced4ddcb4097134ff3c332f xmlns="4b926790-beef-4c3a-b2b0-daa3a2e6a4f3">
+      <Terms xmlns="http://schemas.microsoft.com/office/infopath/2007/PartnerControls"/>
+    </lcf76f155ced4ddcb4097134ff3c332f>
+  </documentManagement>
+</p:properties>
+</file>
+
+<file path=customXml/item2.xml><?xml version="1.0" encoding="utf-8"?>
 <ct:contentTypeSchema xmlns:ct="http://schemas.microsoft.com/office/2006/metadata/contentType" xmlns:ma="http://schemas.microsoft.com/office/2006/metadata/properties/metaAttributes" ct:_="" ma:_="" ma:contentTypeName="Document" ma:contentTypeID="0x010100A7F1DC8B1EC53C4997F0411CE1BD0815" ma:contentTypeVersion="14" ma:contentTypeDescription="Create a new document." ma:contentTypeScope="" ma:versionID="b3ae2dcf9f17309f74c6b430890576af">
   <xsd:schema xmlns:xsd="http://www.w3.org/2001/XMLSchema" xmlns:xs="http://www.w3.org/2001/XMLSchema" xmlns:p="http://schemas.microsoft.com/office/2006/metadata/properties" xmlns:ns2="4b926790-beef-4c3a-b2b0-daa3a2e6a4f3" xmlns:ns3="4c61e19b-130e-4f0e-85ad-f29bf0e78033" targetNamespace="http://schemas.microsoft.com/office/2006/metadata/properties" ma:root="true" ma:fieldsID="5e39edc2543a9a2d90626ee7dc5124e3" ns2:_="" ns3:_="">
     <xsd:import namespace="4b926790-beef-4c3a-b2b0-daa3a2e6a4f3"/>
@@ -2700,24 +2610,6 @@
 </ct:contentTypeSchema>
 </file>
 
-<file path=customXml/item2.xml><?xml version="1.0" encoding="utf-8"?>
-<p:properties xmlns:p="http://schemas.microsoft.com/office/2006/metadata/properties" xmlns:xsi="http://www.w3.org/2001/XMLSchema-instance" xmlns:pc="http://schemas.microsoft.com/office/infopath/2007/PartnerControls">
-  <documentManagement>
-    <SharedWithUsers xmlns="4c61e19b-130e-4f0e-85ad-f29bf0e78033">
-      <UserInfo>
-        <DisplayName/>
-        <AccountId xsi:nil="true"/>
-        <AccountType/>
-      </UserInfo>
-    </SharedWithUsers>
-    <TaxCatchAll xmlns="4c61e19b-130e-4f0e-85ad-f29bf0e78033" xsi:nil="true"/>
-    <lcf76f155ced4ddcb4097134ff3c332f xmlns="4b926790-beef-4c3a-b2b0-daa3a2e6a4f3">
-      <Terms xmlns="http://schemas.microsoft.com/office/infopath/2007/PartnerControls"/>
-    </lcf76f155ced4ddcb4097134ff3c332f>
-  </documentManagement>
-</p:properties>
-</file>
-
 <file path=customXml/item3.xml><?xml version="1.0" encoding="utf-8"?>
 <?mso-contentType ?>
 <FormTemplates xmlns="http://schemas.microsoft.com/sharepoint/v3/contenttype/forms">
@@ -2728,6 +2620,17 @@
 </file>
 
 <file path=customXml/itemProps1.xml><?xml version="1.0" encoding="utf-8"?>
+<ds:datastoreItem xmlns:ds="http://schemas.openxmlformats.org/officeDocument/2006/customXml" ds:itemID="{3304563A-0FE7-4167-BC19-B92FC0BA4EF8}">
+  <ds:schemaRefs>
+    <ds:schemaRef ds:uri="http://schemas.microsoft.com/office/2006/metadata/properties"/>
+    <ds:schemaRef ds:uri="http://schemas.microsoft.com/office/infopath/2007/PartnerControls"/>
+    <ds:schemaRef ds:uri="4c61e19b-130e-4f0e-85ad-f29bf0e78033"/>
+    <ds:schemaRef ds:uri="4b926790-beef-4c3a-b2b0-daa3a2e6a4f3"/>
+  </ds:schemaRefs>
+</ds:datastoreItem>
+</file>
+
+<file path=customXml/itemProps2.xml><?xml version="1.0" encoding="utf-8"?>
 <ds:datastoreItem xmlns:ds="http://schemas.openxmlformats.org/officeDocument/2006/customXml" ds:itemID="{07B7F136-A163-4614-ACD8-3714916BA559}">
   <ds:schemaRefs>
     <ds:schemaRef ds:uri="http://schemas.microsoft.com/office/2006/metadata/contentType"/>
@@ -2746,17 +2649,6 @@
 </ds:datastoreItem>
 </file>
 
-<file path=customXml/itemProps2.xml><?xml version="1.0" encoding="utf-8"?>
-<ds:datastoreItem xmlns:ds="http://schemas.openxmlformats.org/officeDocument/2006/customXml" ds:itemID="{3304563A-0FE7-4167-BC19-B92FC0BA4EF8}">
-  <ds:schemaRefs>
-    <ds:schemaRef ds:uri="http://schemas.microsoft.com/office/2006/metadata/properties"/>
-    <ds:schemaRef ds:uri="http://schemas.microsoft.com/office/infopath/2007/PartnerControls"/>
-    <ds:schemaRef ds:uri="4c61e19b-130e-4f0e-85ad-f29bf0e78033"/>
-    <ds:schemaRef ds:uri="4b926790-beef-4c3a-b2b0-daa3a2e6a4f3"/>
-  </ds:schemaRefs>
-</ds:datastoreItem>
-</file>
-
 <file path=customXml/itemProps3.xml><?xml version="1.0" encoding="utf-8"?>
 <ds:datastoreItem xmlns:ds="http://schemas.openxmlformats.org/officeDocument/2006/customXml" ds:itemID="{F9CFFE37-5ACF-49B4-8BC7-C5050E6AAA78}">
   <ds:schemaRefs>

</xml_diff>